<commit_message>
Add adsorption contact geometry and clarify thesis
Co-authored-by: arena-agent <297053741+arena-agent@users.noreply.github.com>
</commit_message>
<xml_diff>
--- a/deliverables/Ahmad_Usman_Shehu_U19CE1068_Thesis.docx
+++ b/deliverables/Ahmad_Usman_Shehu_U19CE1068_Thesis.docx
@@ -465,7 +465,7 @@
           <w:color w:val="000000"/>
           <w:sz w:val="24"/>
         </w:rPr>
-        <w:t>Vanadium contamination reduced the activity of Zeolite Y catalysts used in residue fluid catalytic cracking (RFCC). Proposed mechanisms assigned framework damage to vanadic acid formed from vanadium oxide and steam or to steam hydrolysis. This study compared vanadic acid (H</w:t>
+        <w:t>Vanadium contamination reduced Zeolite Y activity in residue fluid catalytic cracking (RFCC). Proposed mechanisms attributed framework damage to vanadic acid or steam hydrolysis. This study compared vanadic acid (H</w:t>
       </w:r>
       <w:r>
         <w:rPr>
@@ -507,7 +507,7 @@
           <w:color w:val="000000"/>
           <w:sz w:val="24"/>
         </w:rPr>
-        <w:t>) and water at a model Brønsted acid site using a 22-atom AlSi</w:t>
+        <w:t>) and water at a model Zeolite Y Brønsted acid site using a 22-atom AlSi</w:t>
       </w:r>
       <w:r>
         <w:rPr>
@@ -612,7 +612,7 @@
           <w:color w:val="000000"/>
           <w:sz w:val="24"/>
         </w:rPr>
-        <w:t xml:space="preserve"> at the two temperatures. A formal competitive-site estimate using regenerator partial pressures gave a water-to-vanadic-acid occupation ratio of 5.7 × 10</w:t>
+        <w:t xml:space="preserve"> at the two temperatures. Vanadic acid formed Al···O and V···O contacts of 1.947 and 2.274 Å; water formed two hydrogen bonds with H···O distances of 1.587 and 1.825 Å. A formal competitive-site estimate using regenerator partial pressures gave a water-to-vanadic-acid site-fraction ratio of 5.7 × 10</w:t>
       </w:r>
       <w:r>
         <w:rPr>
@@ -675,7 +675,7 @@
           <w:color w:val="000000"/>
           <w:sz w:val="24"/>
         </w:rPr>
-        <w:t xml:space="preserve"> candidate barrier for first Al–O cleavage; Appendix A records the DFT and water-path assessments. The results established a modest electronic binding preference and a conditional high-temperature site comparison. Larger pore-aware models and validated DFT reaction paths were recommended.</w:t>
+        <w:t xml:space="preserve"> candidate barrier for the first Al–O cleavage step; Appendix A records the DFT frequency and water-path displacement assessments. Electronic binding and high-temperature site occupation favoured different adsorbates. Larger pore-aware models and validated DFT reaction paths were recommended.</w:t>
       </w:r>
     </w:p>
     <w:p>
@@ -1609,7 +1609,7 @@
           <w:color w:val="000000"/>
           <w:sz w:val="24"/>
         </w:rPr>
-        <w:t>Residue fluid catalytic cracking (RFCC) converts heavy refinery feedstocks into lighter products. Its catalyst contains Zeolite Y, whose Brønsted acid sites support cracking reactions. Vanadium and other metals carried in residue feed accumulate on the catalyst during operation and are associated with loss of zeolite activity during regeneration (Adanenche et al., 2023; Wormsbecher, Peters, &amp; Maselli, 1986).</w:t>
+        <w:t>Residue fluid catalytic cracking (RFCC) converts heavy refinery feedstocks into lighter products. Its catalyst contains Zeolite Y, whose Brønsted acid sites support cracking reactions. Vanadium and other metals in residue feed accumulate on the catalyst during operation. Their accumulation is associated with loss of Zeolite Y activity during regeneration (Adanenche et al., 2023; Wormsbecher, Peters, &amp; Maselli, 1986).</w:t>
       </w:r>
     </w:p>
     <w:p>
@@ -1749,7 +1749,7 @@
           <w:color w:val="000000"/>
           <w:sz w:val="24"/>
         </w:rPr>
-        <w:t>The aim of this study was to compare vanadic acid and water at a model Zeolite Y Brønsted acid site and assess the implications of their adsorption, pathway, and thermochemical results for dealumination.</w:t>
+        <w:t>The aim was to compare vanadic acid and water at a model Zeolite Y Brønsted acid site and assess their implications for dealumination.</w:t>
       </w:r>
     </w:p>
     <w:p>
@@ -2217,7 +2217,7 @@
           <w:color w:val="000000"/>
           <w:sz w:val="24"/>
         </w:rPr>
-        <w:t>Steam hydrolyses framework Al–O–Si bonds during catalyst regeneration. Density functional theory calculations by Malola et al. (2012) described dealumination as a sequence of water-assisted bond-cleavage steps. Their calculated effective barriers depended on the reference state for incoming water, demonstrating the role of adsorption thermochemistry in reaction energetics. Figure 2.2 presents their calculated reaction paths for dealumination and desilication.</w:t>
+        <w:t>Steam hydrolyses framework Al–O–Si bonds during catalyst regeneration. Density functional theory (DFT) calculations by Malola et al. (2012) described dealumination as a sequence of water-assisted bond-cleavage steps. Their calculated effective barriers depended on the reference state for incoming water, demonstrating the role of adsorption thermochemistry in reaction energetics. Figure 2.2 presents their calculated reaction paths for dealumination and desilication.</w:t>
       </w:r>
     </w:p>
     <w:p>
@@ -3380,7 +3380,7 @@
           <w:color w:val="000000"/>
           <w:sz w:val="24"/>
         </w:rPr>
-        <w:t>The calculations modelled vanadic acid and water at one Zeolite Y Brønsted acid site. They evaluated optimised structures, electronic adsorption energies, candidate reaction paths, and harmonic thermochemistry. GFN2-xTB calculations were run with ORCA 6.1.0 on a Dell Latitude E6430 laptop with 16 GB of memory and one processor core. DFT calculations were run with ORCA 6.1.1 on a cloud virtual machine using four MPI processes (Neese, 2025). Molecular structures were prepared and checked with Spartan and Avogadro; Python scripts processed ORCA outputs and calculation registers. Figure 3.1 summarises the structure-screening, DFT, pathway, and thermochemistry stages.</w:t>
+        <w:t>The calculations modelled vanadic acid and water at one Zeolite Y Brønsted acid site. They evaluated optimised structures, electronic adsorption energies, candidate reaction paths, and harmonic thermochemistry. GFN2-xTB provided the Tier 1 screening calculations, which were run with ORCA 6.1.0 on a Dell Latitude E6430 laptop with 16 GB of memory and one processor core. Tier 2 DFT calculations were run with ORCA 6.1.1 on a cloud virtual machine using four MPI processes (Neese, 2025). Molecular structures were prepared and checked with Spartan and Avogadro; Python scripts processed ORCA outputs and calculation registers. Figure 3.1 summarises the structure-screening, DFT, pathway, and thermochemistry stages.</w:t>
       </w:r>
     </w:p>
     <w:p>
@@ -4126,7 +4126,7 @@
           <w:color w:val="000000"/>
           <w:sz w:val="24"/>
         </w:rPr>
-        <w:t>Candidate reaction paths were explored for the vanadic-acid route and a water-hydrolysis control. GFN2-xTB nudged elastic band calculations were followed by eigenvector-following transition-state optimisations (Henkelman &amp; Jónsson, 2000). Frequency calculations and displacements in both directions along each candidate imaginary mode assessed the connection between neighbouring minima.</w:t>
+        <w:t>Candidate reaction paths were explored for the vanadic-acid route and a water-hydrolysis control. GFN2-xTB nudged elastic band calculations were followed by eigenvector-following transition-state optimisations (Henkelman &amp; Jónsson, 2000). For each candidate, frequency analysis located the imaginary mode; structures displaced in both directions along that mode were reoptimised to test whether the candidate connected different minima. The pre-reaction complexes are denoted V-PRC (vanadic acid) and W-PRC (water). V-I1 and V-I2 denote successive vanadic-acid pathway states, W-P denotes the water-path post-adsorption minimum, and V-TS2 and W-TS label the transition-state candidates for the two routes.</w:t>
       </w:r>
     </w:p>
     <w:p>
@@ -4144,7 +4144,7 @@
           <w:color w:val="000000"/>
           <w:sz w:val="24"/>
         </w:rPr>
-        <w:t>Acceptance required a converged optimisation, one chemically meaningful imaginary mode, and two displaced structures that relaxed towards different minima. The accepted Tier 1 candidate for the first framework Al–O cleavage step was assessed against these criteria. Appendix A.3 records the candidate frequencies, displacement destinations, and final pathway classifications.</w:t>
+        <w:t>Acceptance required a converged optimisation, one chemically meaningful imaginary mode, and two displaced structures that relaxed towards different minima. The V-TS2 candidate for the first framework Al–O cleavage step met these Tier 1 criteria. Appendix A.3 records the candidate frequencies, displacement destinations, and final pathway classifications.</w:t>
       </w:r>
     </w:p>
     <w:p>
@@ -4290,7 +4290,7 @@
           <w:color w:val="000000"/>
           <w:sz w:val="24"/>
         </w:rPr>
-        <w:t>A conditional competitive-site estimate was calculated at 1003.15 K using the RFCC gas partial pressures discussed by Wormsbecher et al. (1986). Twenty per cent steam at 2 atm total pressure gives a water partial pressure of 0.4 atm; 1–10 ppm vanadic acid gives a partial-pressure range of 2 × 10</w:t>
+        <w:t>A conditional competitive-site estimate was calculated at 1003.15 K using the RFCC gas partial pressures reported by Wormsbecher et al. (1986). At 2 atm total pressure, 20% steam gave a water partial pressure of 0.4 atm. At the same pressure, 1–10 ppm vanadic acid corresponded to partial pressures of 2 × 10</w:t>
       </w:r>
       <w:r>
         <w:rPr>
@@ -4332,7 +4332,7 @@
           <w:color w:val="000000"/>
           <w:sz w:val="24"/>
         </w:rPr>
-        <w:t xml:space="preserve"> atm. Appendix B.1 shows these conversions. The dimensionless standard equilibrium constant was calculated using Eq. (3.4), and Eq. (3.5) gives the competitive site fraction:</w:t>
+        <w:t xml:space="preserve"> atm. Appendix B.1 shows these conversions. The dimensionless standard equilibrium constant for each adsorbate was calculated using Eq. (3.4). Equation (3.5) gives the fraction of sites occupied by each adsorbate:</w:t>
       </w:r>
     </w:p>
     <w:p>
@@ -4418,7 +4418,7 @@
           <w:color w:val="000000"/>
           <w:sz w:val="24"/>
         </w:rPr>
-        <w:t>The estimate used one equivalent site, ideal-gas standard states, and independent adsorbates. Equations (3.4) and (3.5) define a conditional model calculation for the stated gas composition. Appendix B.5 provides each numerical substitution and the resulting site fractions.</w:t>
+        <w:t>The leading 1 in Eq. (3.5) represents an unoccupied site. The estimate used one equivalent site, ideal-gas standard states, and independent adsorbates. Equations (3.4) and (3.5) define a conditional model calculation for the stated gas composition. Appendix B.5 provides each numerical substitution and the resulting site fractions.</w:t>
       </w:r>
     </w:p>
     <w:p>
@@ -5352,7 +5352,7 @@
           <w:color w:val="000000"/>
           <w:sz w:val="24"/>
         </w:rPr>
-        <w:t>In V-PRC, a vanadic-acid oxygen contacted aluminium while the acid-site Al–O bond lengthened relative to the isolated cluster. W-PRC retained water outside the aluminium coordination sphere. In W-P, a water-derived oxygen approached aluminium as one framework Al–O distance lengthened. These distances show the different local geometries sampled along the two routes.</w:t>
+        <w:t>In V-PRC, the vanadium atom lay 2.274 Å from a framework oxygen, in addition to the Al···O contact listed in Table 4.2. In W-PRC, the acid proton lay 1.587 Å from the water oxygen, and one water hydrogen lay 1.825 Å from a framework oxygen; these geometries support assignment of two hydrogen bonds. The pre-reaction complexes therefore associated with the model acid site through different contact patterns.</w:t>
       </w:r>
     </w:p>
     <w:p>
@@ -6672,7 +6672,7 @@
           <w:color w:val="000000"/>
           <w:sz w:val="24"/>
         </w:rPr>
-        <w:t>, providing a consistent comparison across the two hybrid functionals. GFN2-xTB predicts a substantially larger vanadic-acid preference and serves as the structure-screening level for these adsorbates. The DFT energies are direct values; Appendix A.2 records the counterpoise fragment-job status.</w:t>
+        <w:t>, providing a consistent comparison across the two hybrid functionals. GFN2-xTB predicts a substantially larger vanadic-acid preference and was used for structure screening; the DFT values provide the main electronic-energy comparison. Appendix A.2 records the counterpoise fragment-job status for both adsorbates.</w:t>
       </w:r>
     </w:p>
     <w:p>
@@ -7193,7 +7193,28 @@
                 <w:color w:val="000000"/>
                 <w:sz w:val="24"/>
               </w:rPr>
-              <w:t>Candidate imaginary mode</w:t>
+              <w:t>Imaginary frequency (cm</w:t>
+            </w:r>
+            <w:r>
+              <w:rPr>
+                <w:rFonts w:ascii="Times New Roman" w:hAnsi="Times New Roman" w:cs="Times New Roman" w:eastAsia="Times New Roman"/>
+                <w:b/>
+                <w:i w:val="0"/>
+                <w:color w:val="000000"/>
+                <w:sz w:val="24"/>
+                <w:vertAlign w:val="superscript"/>
+              </w:rPr>
+              <w:t>-1</w:t>
+            </w:r>
+            <w:r>
+              <w:rPr>
+                <w:rFonts w:ascii="Times New Roman" w:hAnsi="Times New Roman" w:cs="Times New Roman" w:eastAsia="Times New Roman"/>
+                <w:b/>
+                <w:i w:val="0"/>
+                <w:color w:val="000000"/>
+                <w:sz w:val="24"/>
+              </w:rPr>
+              <w:t>)</w:t>
             </w:r>
           </w:p>
         </w:tc>
@@ -7217,7 +7238,28 @@
                 <w:color w:val="000000"/>
                 <w:sz w:val="24"/>
               </w:rPr>
-              <w:t>Candidate barrier relative to starting minimum</w:t>
+              <w:t>Candidate energy above starting minimum (kJ mol</w:t>
+            </w:r>
+            <w:r>
+              <w:rPr>
+                <w:rFonts w:ascii="Times New Roman" w:hAnsi="Times New Roman" w:cs="Times New Roman" w:eastAsia="Times New Roman"/>
+                <w:b/>
+                <w:i w:val="0"/>
+                <w:color w:val="000000"/>
+                <w:sz w:val="24"/>
+                <w:vertAlign w:val="superscript"/>
+              </w:rPr>
+              <w:t>-1</w:t>
+            </w:r>
+            <w:r>
+              <w:rPr>
+                <w:rFonts w:ascii="Times New Roman" w:hAnsi="Times New Roman" w:cs="Times New Roman" w:eastAsia="Times New Roman"/>
+                <w:b/>
+                <w:i w:val="0"/>
+                <w:color w:val="000000"/>
+                <w:sz w:val="24"/>
+              </w:rPr>
+              <w:t>)</w:t>
             </w:r>
           </w:p>
         </w:tc>
@@ -7241,7 +7283,7 @@
                 <w:color w:val="000000"/>
                 <w:sz w:val="24"/>
               </w:rPr>
-              <w:t>Assessment record</w:t>
+              <w:t>Assessment</w:t>
             </w:r>
           </w:p>
         </w:tc>
@@ -7294,18 +7336,7 @@
                 <w:color w:val="000000"/>
                 <w:sz w:val="24"/>
               </w:rPr>
-              <w:t>−78.21 cm</w:t>
-            </w:r>
-            <w:r>
-              <w:rPr>
-                <w:rFonts w:ascii="Times New Roman" w:hAnsi="Times New Roman" w:cs="Times New Roman" w:eastAsia="Times New Roman"/>
-                <w:b w:val="0"/>
-                <w:i w:val="0"/>
-                <w:color w:val="000000"/>
-                <w:sz w:val="24"/>
-                <w:vertAlign w:val="superscript"/>
-              </w:rPr>
-              <w:t>-1</w:t>
+              <w:t>−78.21</w:t>
             </w:r>
           </w:p>
         </w:tc>
@@ -7329,18 +7360,7 @@
                 <w:color w:val="000000"/>
                 <w:sz w:val="24"/>
               </w:rPr>
-              <w:t>160.70 kJ mol</w:t>
-            </w:r>
-            <w:r>
-              <w:rPr>
-                <w:rFonts w:ascii="Times New Roman" w:hAnsi="Times New Roman" w:cs="Times New Roman" w:eastAsia="Times New Roman"/>
-                <w:b w:val="0"/>
-                <w:i w:val="0"/>
-                <w:color w:val="000000"/>
-                <w:sz w:val="24"/>
-                <w:vertAlign w:val="superscript"/>
-              </w:rPr>
-              <w:t>-1</w:t>
+              <w:t>160.70</w:t>
             </w:r>
           </w:p>
         </w:tc>
@@ -7364,7 +7384,7 @@
                 <w:color w:val="000000"/>
                 <w:sz w:val="24"/>
               </w:rPr>
-              <w:t>V-TS2 passed the Tier 1 transition-state criteria</w:t>
+              <w:t>V-TS2 passed the GFN2-xTB Tier 1 criteria</w:t>
             </w:r>
           </w:p>
         </w:tc>
@@ -7417,18 +7437,7 @@
                 <w:color w:val="000000"/>
                 <w:sz w:val="24"/>
               </w:rPr>
-              <w:t>−226.10 cm</w:t>
-            </w:r>
-            <w:r>
-              <w:rPr>
-                <w:rFonts w:ascii="Times New Roman" w:hAnsi="Times New Roman" w:cs="Times New Roman" w:eastAsia="Times New Roman"/>
-                <w:b w:val="0"/>
-                <w:i w:val="0"/>
-                <w:color w:val="000000"/>
-                <w:sz w:val="24"/>
-                <w:vertAlign w:val="superscript"/>
-              </w:rPr>
-              <w:t>-1</w:t>
+              <w:t>−226.10</w:t>
             </w:r>
           </w:p>
         </w:tc>
@@ -7452,18 +7461,7 @@
                 <w:color w:val="000000"/>
                 <w:sz w:val="24"/>
               </w:rPr>
-              <w:t>29.29 kJ mol</w:t>
-            </w:r>
-            <w:r>
-              <w:rPr>
-                <w:rFonts w:ascii="Times New Roman" w:hAnsi="Times New Roman" w:cs="Times New Roman" w:eastAsia="Times New Roman"/>
-                <w:b w:val="0"/>
-                <w:i w:val="0"/>
-                <w:color w:val="000000"/>
-                <w:sz w:val="24"/>
-                <w:vertAlign w:val="superscript"/>
-              </w:rPr>
-              <w:t>-1</w:t>
+              <w:t>29.29</w:t>
             </w:r>
           </w:p>
         </w:tc>
@@ -7513,7 +7511,28 @@
           <w:color w:val="000000"/>
           <w:sz w:val="24"/>
         </w:rPr>
-        <w:t>The accepted GFN2-xTB candidate provides a screening-level energy for the first vanadic-acid cleavage step. The DFT and water-path outcomes in Appendix A show the distinction between a screening candidate and a validated reaction-path barrier. The reported barrier therefore describes the GFN2-xTB model and its accepted candidate geometry.</w:t>
+        <w:t>The 160.70 kJ mol</w:t>
+      </w:r>
+      <w:r>
+        <w:rPr>
+          <w:rFonts w:ascii="Times New Roman" w:hAnsi="Times New Roman" w:cs="Times New Roman" w:eastAsia="Times New Roman"/>
+          <w:b w:val="0"/>
+          <w:i w:val="0"/>
+          <w:color w:val="000000"/>
+          <w:sz w:val="24"/>
+          <w:vertAlign w:val="superscript"/>
+        </w:rPr>
+        <w:t>-1</w:t>
+      </w:r>
+      <w:r>
+        <w:rPr>
+          <w:rFonts w:ascii="Times New Roman" w:hAnsi="Times New Roman" w:cs="Times New Roman" w:eastAsia="Times New Roman"/>
+          <w:b w:val="0"/>
+          <w:i w:val="0"/>
+          <w:color w:val="000000"/>
+          <w:sz w:val="24"/>
+        </w:rPr>
+        <w:t xml:space="preserve"> value is an accepted GFN2-xTB screening candidate, not a validated DFT barrier. Appendix A records the separate DFT search and water-path assessments.</w:t>
       </w:r>
     </w:p>
     <w:p>
@@ -7547,7 +7566,7 @@
           <w:color w:val="000000"/>
           <w:sz w:val="24"/>
         </w:rPr>
-        <w:t>Table 4.6 compares harmonic Gibbs energies at 298.15 K and 1003.15 K, using the separated cluster and adsorbate as the reference. Water has the more favourable adsorption Gibbs energy at both temperatures. The difference increases from 11.82 kJ mol</w:t>
+        <w:t>Table 4.6 compares harmonic Gibbs energies at 298.15 K and 1003.15 K, using the separated cluster and adsorbate as the reference. Water has the more favourable adsorption Gibbs energy at both temperatures. Its Gibbs-energy advantage increases from 11.82 kJ mol</w:t>
       </w:r>
       <w:r>
         <w:rPr>
@@ -8117,7 +8136,7 @@
           <w:color w:val="000000"/>
           <w:sz w:val="24"/>
         </w:rPr>
-        <w:t>The 1003.15 K Gibbs energies for V-PRC and W-PRC were combined with the regenerator partial pressures to calculate a competitive-site scenario. Table 4.7 gives the dimensionless equilibrium constants and fractions from Eqs. (3.4) and (3.5). Appendix B.1 and B.5 show the pressure and site-fraction substitutions.</w:t>
+        <w:t>The model combined the 1003.15 K Gibbs adsorption energies for V-PRC and W-PRC with the regenerator gas partial pressures. Equations (3.4) and (3.5) were used to calculate the equilibrium constants and conditional site fractions in Table 4.7. Appendix B.1 and B.5 show the pressure and site-fraction substitutions.</w:t>
       </w:r>
     </w:p>
     <w:p>
@@ -8868,7 +8887,7 @@
           <w:color w:val="000000"/>
           <w:sz w:val="24"/>
         </w:rPr>
-        <w:t>The DFT energies favour electronic binding of vanadic acid, while the high-temperature Gibbs energies and steam-rich gas favour water in the conditional site-occupation scenario. Table 2.1 and Figure 2.3 place these results alongside the vanadic-acid, steam-dominated, and sodium-mediated mechanisms discussed by Wormsbecher et al. (1986), Trujillo et al. (1997), Pine (1990), and Xu et al. (2002). The adsorption comparison describes acid-site association; the pathway assessment in Appendix A supplies the corresponding transition-state evidence. Together, the results identify electronic binding, thermal competition, and pathway energy as separate quantities for evaluating Zeolite Y dealumination.</w:t>
+        <w:t>The DFT energies favour electronic binding of vanadic acid, while the high-temperature Gibbs energies and steam-rich gas favour water in the conditional site-occupation scenario. Table 2.1 and Figure 2.3 place these results alongside the vanadic-acid, steam-dominated, and sodium-mediated mechanisms discussed by Wormsbecher et al. (1986), Trujillo et al. (1997), Pine (1990), and Xu et al. (2002). The adsorption calculations address acid-site association, while the pathway search provides a screening-level comparison of the first Al–O cleavage step; Appendix A records the corresponding job statuses. Together, the results identify electronic binding, thermal competition, and pathway energy as separate quantities for evaluating Zeolite Y dealumination.</w:t>
       </w:r>
     </w:p>
     <w:p>
@@ -9157,7 +9176,7 @@
           <w:color w:val="000000"/>
           <w:sz w:val="24"/>
         </w:rPr>
-        <w:t>3. The pathway search produced an accepted GFN2-xTB candidate for the first vanadic-acid Al–O cleavage step, with a barrier of 160.70 kJ mol</w:t>
+        <w:t>3. The GFN2-xTB search yielded a screening-level candidate barrier of 160.70 kJ mol</w:t>
       </w:r>
       <w:r>
         <w:rPr>
@@ -9178,7 +9197,7 @@
           <w:color w:val="000000"/>
           <w:sz w:val="24"/>
         </w:rPr>
-        <w:t xml:space="preserve"> above V-I1. Appendix A records the DFT frequency assessment and the water-path displacement outcome.</w:t>
+        <w:t xml:space="preserve"> above V-I1 for the first Al–O cleavage step in the vanadic-acid route. Appendix A records the separate DFT frequency and water-path assessments.</w:t>
       </w:r>
     </w:p>
     <w:p>
@@ -9238,7 +9257,7 @@
           <w:color w:val="000000"/>
           <w:sz w:val="24"/>
         </w:rPr>
-        <w:t xml:space="preserve"> at 1003.15 K. For the stated regenerator partial pressures, the formal single-site estimate gave a water-to-vanadic-acid occupation ratio of 5.7 × 10</w:t>
+        <w:t xml:space="preserve"> at 1003.15 K. Under the stated regenerator partial pressures, the conditional single-site model gave a water-to-vanadic-acid site-fraction ratio of 5.7 × 10</w:t>
       </w:r>
       <w:r>
         <w:rPr>

</xml_diff>